<commit_message>
docs: add detailed SSL and IIS setup documentation
</commit_message>
<xml_diff>
--- a/MERN_IIS_Production_Setup_Guide.docx
+++ b/MERN_IIS_Production_Setup_Guide.docx
@@ -496,7 +496,7 @@
       </w:pPr>
       <w:r>
         <w:pict w14:anchorId="0D8439BA">
-          <v:rect id="_x0000_i1052" style="width:0;height:1.5pt" o:hralign="center" o:hrstd="t" o:hr="t" fillcolor="#a0a0a0" stroked="f"/>
+          <v:rect id="_x0000_i1025" style="width:0;height:1.5pt" o:hralign="center" o:hrstd="t" o:hr="t" fillcolor="#a0a0a0" stroked="f"/>
         </w:pict>
       </w:r>
     </w:p>
@@ -590,6 +590,993 @@
       </w:r>
       <w:r>
         <w:t xml:space="preserve"> Where you verify the changes on https://ecommerce.test.</w:t>
+      </w:r>
+    </w:p>
+    <w:p>
+      <w:pPr>
+        <w:spacing w:after="0"/>
+      </w:pPr>
+    </w:p>
+    <w:p>
+      <w:pPr>
+        <w:spacing w:after="0"/>
+      </w:pPr>
+    </w:p>
+    <w:p>
+      <w:pPr>
+        <w:spacing w:after="0"/>
+      </w:pPr>
+    </w:p>
+    <w:p>
+      <w:pPr>
+        <w:spacing w:after="0"/>
+      </w:pPr>
+    </w:p>
+    <w:p>
+      <w:pPr>
+        <w:spacing w:after="0"/>
+      </w:pPr>
+    </w:p>
+    <w:p>
+      <w:pPr>
+        <w:spacing w:after="0"/>
+      </w:pPr>
+    </w:p>
+    <w:p>
+      <w:pPr>
+        <w:spacing w:after="0"/>
+      </w:pPr>
+    </w:p>
+    <w:p>
+      <w:pPr>
+        <w:spacing w:after="0"/>
+      </w:pPr>
+    </w:p>
+    <w:p>
+      <w:pPr>
+        <w:spacing w:after="0"/>
+      </w:pPr>
+    </w:p>
+    <w:p>
+      <w:pPr>
+        <w:spacing w:after="0"/>
+      </w:pPr>
+    </w:p>
+    <w:p>
+      <w:pPr>
+        <w:spacing w:after="0"/>
+      </w:pPr>
+    </w:p>
+    <w:p>
+      <w:pPr>
+        <w:spacing w:after="0"/>
+      </w:pPr>
+    </w:p>
+    <w:p>
+      <w:pPr>
+        <w:spacing w:after="0"/>
+      </w:pPr>
+    </w:p>
+    <w:p>
+      <w:pPr>
+        <w:spacing w:after="0"/>
+      </w:pPr>
+    </w:p>
+    <w:p>
+      <w:pPr>
+        <w:spacing w:after="0"/>
+      </w:pPr>
+    </w:p>
+    <w:p>
+      <w:pPr>
+        <w:spacing w:after="0"/>
+        <w:rPr>
+          <w:b/>
+          <w:bCs/>
+        </w:rPr>
+      </w:pPr>
+      <w:r>
+        <w:rPr>
+          <w:b/>
+          <w:bCs/>
+        </w:rPr>
+        <w:lastRenderedPageBreak/>
+        <w:t xml:space="preserve">How to Renew and Re-bind Expired </w:t>
+      </w:r>
+      <w:proofErr w:type="spellStart"/>
+      <w:r>
+        <w:rPr>
+          <w:b/>
+          <w:bCs/>
+        </w:rPr>
+        <w:t>mkcert</w:t>
+      </w:r>
+      <w:proofErr w:type="spellEnd"/>
+      <w:r>
+        <w:rPr>
+          <w:b/>
+          <w:bCs/>
+        </w:rPr>
+        <w:t xml:space="preserve"> Certificates in Windows</w:t>
+      </w:r>
+    </w:p>
+    <w:p>
+      <w:pPr>
+        <w:spacing w:after="0"/>
+      </w:pPr>
+      <w:r>
+        <w:t xml:space="preserve">If your local certificate expires (which </w:t>
+      </w:r>
+      <w:proofErr w:type="spellStart"/>
+      <w:r>
+        <w:t>mkcert</w:t>
+      </w:r>
+      <w:proofErr w:type="spellEnd"/>
+      <w:r>
+        <w:t xml:space="preserve"> usually sets for about 2 years or 10 years depending on the version), or if the "password" (the private key linkage) becomes invalid, you just need to perform a quick "Renew and Re-bind" process.</w:t>
+      </w:r>
+    </w:p>
+    <w:p>
+      <w:pPr>
+        <w:spacing w:after="0"/>
+      </w:pPr>
+    </w:p>
+    <w:p>
+      <w:pPr>
+        <w:spacing w:after="0"/>
+        <w:rPr>
+          <w:b/>
+          <w:bCs/>
+        </w:rPr>
+      </w:pPr>
+      <w:r>
+        <w:rPr>
+          <w:b/>
+          <w:bCs/>
+        </w:rPr>
+        <w:t>Step 1: Generate New Files</w:t>
+      </w:r>
+    </w:p>
+    <w:p>
+      <w:pPr>
+        <w:spacing w:after="0"/>
+      </w:pPr>
+      <w:r>
+        <w:t xml:space="preserve">In your D:\Ecommerce\dashboard (and backend) folders, run the </w:t>
+      </w:r>
+      <w:proofErr w:type="spellStart"/>
+      <w:r>
+        <w:t>mkcert</w:t>
+      </w:r>
+      <w:proofErr w:type="spellEnd"/>
+      <w:r>
+        <w:t xml:space="preserve"> command again. This overwrites the old files with fresh ones that have a new expiration date.</w:t>
+      </w:r>
+    </w:p>
+    <w:p>
+      <w:pPr>
+        <w:spacing w:after="0"/>
+      </w:pPr>
+    </w:p>
+    <w:p>
+      <w:pPr>
+        <w:spacing w:after="0"/>
+      </w:pPr>
+      <w:r>
+        <w:rPr>
+          <w:b/>
+          <w:bCs/>
+          <w:highlight w:val="yellow"/>
+        </w:rPr>
+        <w:t>PowerShell</w:t>
+      </w:r>
+      <w:r>
+        <w:rPr>
+          <w:highlight w:val="yellow"/>
+        </w:rPr>
+        <w:t xml:space="preserve">:  </w:t>
+      </w:r>
+      <w:r>
+        <w:rPr>
+          <w:highlight w:val="yellow"/>
+        </w:rPr>
+        <w:t xml:space="preserve">.\mkcert.exe </w:t>
+      </w:r>
+      <w:proofErr w:type="spellStart"/>
+      <w:r>
+        <w:rPr>
+          <w:highlight w:val="yellow"/>
+        </w:rPr>
+        <w:t>ecommerce.test</w:t>
+      </w:r>
+      <w:proofErr w:type="spellEnd"/>
+    </w:p>
+    <w:p>
+      <w:pPr>
+        <w:spacing w:after="0"/>
+      </w:pPr>
+    </w:p>
+    <w:p>
+      <w:pPr>
+        <w:spacing w:after="0"/>
+        <w:rPr>
+          <w:b/>
+          <w:bCs/>
+        </w:rPr>
+      </w:pPr>
+      <w:r>
+        <w:rPr>
+          <w:b/>
+          <w:bCs/>
+        </w:rPr>
+        <w:t>Step 2: Re-register with Windows</w:t>
+      </w:r>
+    </w:p>
+    <w:p>
+      <w:pPr>
+        <w:spacing w:after="0"/>
+      </w:pPr>
+      <w:r>
+        <w:t>Run the PowerShell script we used earlier. This will bundle the new PEM files into a PFX and push them into the Windows Certificate Store, replacing the expired one.</w:t>
+      </w:r>
+    </w:p>
+    <w:p>
+      <w:pPr>
+        <w:spacing w:after="0"/>
+      </w:pPr>
+    </w:p>
+    <w:p>
+      <w:pPr>
+        <w:spacing w:after="0"/>
+        <w:rPr>
+          <w:b/>
+          <w:bCs/>
+        </w:rPr>
+      </w:pPr>
+      <w:r>
+        <w:rPr>
+          <w:b/>
+          <w:bCs/>
+          <w:highlight w:val="yellow"/>
+        </w:rPr>
+        <w:t>PowerShell</w:t>
+      </w:r>
+    </w:p>
+    <w:p>
+      <w:pPr>
+        <w:spacing w:after="0"/>
+      </w:pPr>
+      <w:r>
+        <w:rPr>
+          <w:highlight w:val="yellow"/>
+        </w:rPr>
+        <w:t>$</w:t>
+      </w:r>
+      <w:proofErr w:type="spellStart"/>
+      <w:r>
+        <w:rPr>
+          <w:highlight w:val="yellow"/>
+        </w:rPr>
+        <w:t>certPath</w:t>
+      </w:r>
+      <w:proofErr w:type="spellEnd"/>
+      <w:r>
+        <w:rPr>
+          <w:highlight w:val="yellow"/>
+        </w:rPr>
+        <w:t xml:space="preserve"> = "D:\Ecommerce\dashboard\ecommerce.test.pem"</w:t>
+      </w:r>
+    </w:p>
+    <w:p>
+      <w:pPr>
+        <w:spacing w:after="0"/>
+      </w:pPr>
+      <w:r>
+        <w:rPr>
+          <w:highlight w:val="yellow"/>
+        </w:rPr>
+        <w:t>$</w:t>
+      </w:r>
+      <w:proofErr w:type="spellStart"/>
+      <w:r>
+        <w:rPr>
+          <w:highlight w:val="yellow"/>
+        </w:rPr>
+        <w:t>pfxPath</w:t>
+      </w:r>
+      <w:proofErr w:type="spellEnd"/>
+      <w:r>
+        <w:rPr>
+          <w:highlight w:val="yellow"/>
+        </w:rPr>
+        <w:t xml:space="preserve"> = "D:\Ecommerce\dashboard\ecommerce_final.pfx"</w:t>
+      </w:r>
+    </w:p>
+    <w:p>
+      <w:pPr>
+        <w:spacing w:after="0"/>
+      </w:pPr>
+    </w:p>
+    <w:p>
+      <w:pPr>
+        <w:spacing w:after="0"/>
+        <w:rPr>
+          <w:highlight w:val="yellow"/>
+        </w:rPr>
+      </w:pPr>
+      <w:r>
+        <w:rPr>
+          <w:highlight w:val="yellow"/>
+        </w:rPr>
+        <w:t xml:space="preserve">$cert = New-Object </w:t>
+      </w:r>
+      <w:proofErr w:type="gramStart"/>
+      <w:r>
+        <w:rPr>
+          <w:highlight w:val="yellow"/>
+        </w:rPr>
+        <w:t>System.Security.Cryptography.X</w:t>
+      </w:r>
+      <w:proofErr w:type="gramEnd"/>
+      <w:r>
+        <w:rPr>
+          <w:highlight w:val="yellow"/>
+        </w:rPr>
+        <w:t>509Certificates.X509Certificate2($certPath)</w:t>
+      </w:r>
+    </w:p>
+    <w:p>
+      <w:pPr>
+        <w:spacing w:after="0"/>
+        <w:rPr>
+          <w:highlight w:val="yellow"/>
+        </w:rPr>
+      </w:pPr>
+      <w:r>
+        <w:rPr>
+          <w:highlight w:val="yellow"/>
+        </w:rPr>
+        <w:t>$</w:t>
+      </w:r>
+      <w:proofErr w:type="spellStart"/>
+      <w:r>
+        <w:rPr>
+          <w:highlight w:val="yellow"/>
+        </w:rPr>
+        <w:t>pfxData</w:t>
+      </w:r>
+      <w:proofErr w:type="spellEnd"/>
+      <w:r>
+        <w:rPr>
+          <w:highlight w:val="yellow"/>
+        </w:rPr>
+        <w:t xml:space="preserve"> = $</w:t>
+      </w:r>
+      <w:proofErr w:type="gramStart"/>
+      <w:r>
+        <w:rPr>
+          <w:highlight w:val="yellow"/>
+        </w:rPr>
+        <w:t>cert.Export</w:t>
+      </w:r>
+      <w:proofErr w:type="gramEnd"/>
+      <w:r>
+        <w:rPr>
+          <w:highlight w:val="yellow"/>
+        </w:rPr>
+        <w:t>([</w:t>
+      </w:r>
+      <w:proofErr w:type="gramStart"/>
+      <w:r>
+        <w:rPr>
+          <w:highlight w:val="yellow"/>
+        </w:rPr>
+        <w:t>System.Security.Cryptography.X</w:t>
+      </w:r>
+      <w:proofErr w:type="gramEnd"/>
+      <w:r>
+        <w:rPr>
+          <w:highlight w:val="yellow"/>
+        </w:rPr>
+        <w:t>509Certificates.X509ContentType</w:t>
+      </w:r>
+      <w:proofErr w:type="gramStart"/>
+      <w:r>
+        <w:rPr>
+          <w:highlight w:val="yellow"/>
+        </w:rPr>
+        <w:t>]::</w:t>
+      </w:r>
+      <w:proofErr w:type="gramEnd"/>
+      <w:r>
+        <w:rPr>
+          <w:highlight w:val="yellow"/>
+        </w:rPr>
+        <w:t>Pfx, "1234")</w:t>
+      </w:r>
+    </w:p>
+    <w:p>
+      <w:pPr>
+        <w:spacing w:after="0"/>
+      </w:pPr>
+      <w:r>
+        <w:rPr>
+          <w:highlight w:val="yellow"/>
+        </w:rPr>
+        <w:t>[</w:t>
+      </w:r>
+      <w:proofErr w:type="spellStart"/>
+      <w:r>
+        <w:rPr>
+          <w:highlight w:val="yellow"/>
+        </w:rPr>
+        <w:t>System.IO.File</w:t>
+      </w:r>
+      <w:proofErr w:type="spellEnd"/>
+      <w:proofErr w:type="gramStart"/>
+      <w:r>
+        <w:rPr>
+          <w:highlight w:val="yellow"/>
+        </w:rPr>
+        <w:t>]::</w:t>
+      </w:r>
+      <w:proofErr w:type="spellStart"/>
+      <w:r>
+        <w:rPr>
+          <w:highlight w:val="yellow"/>
+        </w:rPr>
+        <w:t>WriteAllBytes</w:t>
+      </w:r>
+      <w:proofErr w:type="spellEnd"/>
+      <w:r>
+        <w:rPr>
+          <w:highlight w:val="yellow"/>
+        </w:rPr>
+        <w:t>(</w:t>
+      </w:r>
+      <w:proofErr w:type="gramEnd"/>
+      <w:r>
+        <w:rPr>
+          <w:highlight w:val="yellow"/>
+        </w:rPr>
+        <w:t>$</w:t>
+      </w:r>
+      <w:proofErr w:type="spellStart"/>
+      <w:r>
+        <w:rPr>
+          <w:highlight w:val="yellow"/>
+        </w:rPr>
+        <w:t>pfxPath</w:t>
+      </w:r>
+      <w:proofErr w:type="spellEnd"/>
+      <w:r>
+        <w:rPr>
+          <w:highlight w:val="yellow"/>
+        </w:rPr>
+        <w:t>, $</w:t>
+      </w:r>
+      <w:proofErr w:type="spellStart"/>
+      <w:r>
+        <w:rPr>
+          <w:highlight w:val="yellow"/>
+        </w:rPr>
+        <w:t>pfxData</w:t>
+      </w:r>
+      <w:proofErr w:type="spellEnd"/>
+      <w:r>
+        <w:rPr>
+          <w:highlight w:val="yellow"/>
+        </w:rPr>
+        <w:t>)</w:t>
+      </w:r>
+    </w:p>
+    <w:p>
+      <w:pPr>
+        <w:spacing w:after="0"/>
+      </w:pPr>
+    </w:p>
+    <w:p>
+      <w:pPr>
+        <w:spacing w:after="0"/>
+        <w:rPr>
+          <w:highlight w:val="yellow"/>
+        </w:rPr>
+      </w:pPr>
+      <w:r>
+        <w:rPr>
+          <w:highlight w:val="yellow"/>
+        </w:rPr>
+        <w:t xml:space="preserve">$store = New-Object </w:t>
+      </w:r>
+      <w:proofErr w:type="gramStart"/>
+      <w:r>
+        <w:rPr>
+          <w:highlight w:val="yellow"/>
+        </w:rPr>
+        <w:t>System.Security.Cryptography.X</w:t>
+      </w:r>
+      <w:proofErr w:type="gramEnd"/>
+      <w:r>
+        <w:rPr>
+          <w:highlight w:val="yellow"/>
+        </w:rPr>
+        <w:t>509Certificates.X509</w:t>
+      </w:r>
+      <w:proofErr w:type="gramStart"/>
+      <w:r>
+        <w:rPr>
+          <w:highlight w:val="yellow"/>
+        </w:rPr>
+        <w:t>Store(</w:t>
+      </w:r>
+      <w:proofErr w:type="gramEnd"/>
+      <w:r>
+        <w:rPr>
+          <w:highlight w:val="yellow"/>
+        </w:rPr>
+        <w:t>"My", "</w:t>
+      </w:r>
+      <w:proofErr w:type="spellStart"/>
+      <w:r>
+        <w:rPr>
+          <w:highlight w:val="yellow"/>
+        </w:rPr>
+        <w:t>LocalMachine</w:t>
+      </w:r>
+      <w:proofErr w:type="spellEnd"/>
+      <w:r>
+        <w:rPr>
+          <w:highlight w:val="yellow"/>
+        </w:rPr>
+        <w:t>")</w:t>
+      </w:r>
+    </w:p>
+    <w:p>
+      <w:pPr>
+        <w:spacing w:after="0"/>
+        <w:rPr>
+          <w:highlight w:val="yellow"/>
+        </w:rPr>
+      </w:pPr>
+      <w:r>
+        <w:rPr>
+          <w:highlight w:val="yellow"/>
+        </w:rPr>
+        <w:t>$</w:t>
+      </w:r>
+      <w:proofErr w:type="spellStart"/>
+      <w:proofErr w:type="gramStart"/>
+      <w:r>
+        <w:rPr>
+          <w:highlight w:val="yellow"/>
+        </w:rPr>
+        <w:t>store.Open</w:t>
+      </w:r>
+      <w:proofErr w:type="spellEnd"/>
+      <w:proofErr w:type="gramEnd"/>
+      <w:r>
+        <w:rPr>
+          <w:highlight w:val="yellow"/>
+        </w:rPr>
+        <w:t>("</w:t>
+      </w:r>
+      <w:proofErr w:type="spellStart"/>
+      <w:r>
+        <w:rPr>
+          <w:highlight w:val="yellow"/>
+        </w:rPr>
+        <w:t>ReadWrite</w:t>
+      </w:r>
+      <w:proofErr w:type="spellEnd"/>
+      <w:r>
+        <w:rPr>
+          <w:highlight w:val="yellow"/>
+        </w:rPr>
+        <w:t>")</w:t>
+      </w:r>
+    </w:p>
+    <w:p>
+      <w:pPr>
+        <w:spacing w:after="0"/>
+        <w:rPr>
+          <w:highlight w:val="yellow"/>
+        </w:rPr>
+      </w:pPr>
+      <w:r>
+        <w:rPr>
+          <w:highlight w:val="yellow"/>
+        </w:rPr>
+        <w:t>$</w:t>
+      </w:r>
+      <w:proofErr w:type="spellStart"/>
+      <w:r>
+        <w:rPr>
+          <w:highlight w:val="yellow"/>
+        </w:rPr>
+        <w:t>certToImport</w:t>
+      </w:r>
+      <w:proofErr w:type="spellEnd"/>
+      <w:r>
+        <w:rPr>
+          <w:highlight w:val="yellow"/>
+        </w:rPr>
+        <w:t xml:space="preserve"> = New-Object </w:t>
+      </w:r>
+      <w:proofErr w:type="gramStart"/>
+      <w:r>
+        <w:rPr>
+          <w:highlight w:val="yellow"/>
+        </w:rPr>
+        <w:t>System.Security.Cryptography.X</w:t>
+      </w:r>
+      <w:proofErr w:type="gramEnd"/>
+      <w:r>
+        <w:rPr>
+          <w:highlight w:val="yellow"/>
+        </w:rPr>
+        <w:t>509Certificates.X509Certificate2($pfxPath, "1234", "</w:t>
+      </w:r>
+      <w:proofErr w:type="spellStart"/>
+      <w:proofErr w:type="gramStart"/>
+      <w:r>
+        <w:rPr>
+          <w:highlight w:val="yellow"/>
+        </w:rPr>
+        <w:t>Exportable,PersistKeySet</w:t>
+      </w:r>
+      <w:proofErr w:type="spellEnd"/>
+      <w:proofErr w:type="gramEnd"/>
+      <w:r>
+        <w:rPr>
+          <w:highlight w:val="yellow"/>
+        </w:rPr>
+        <w:t>")</w:t>
+      </w:r>
+    </w:p>
+    <w:p>
+      <w:pPr>
+        <w:spacing w:after="0"/>
+        <w:rPr>
+          <w:highlight w:val="yellow"/>
+        </w:rPr>
+      </w:pPr>
+      <w:r>
+        <w:rPr>
+          <w:highlight w:val="yellow"/>
+        </w:rPr>
+        <w:t>$</w:t>
+      </w:r>
+      <w:proofErr w:type="spellStart"/>
+      <w:proofErr w:type="gramStart"/>
+      <w:r>
+        <w:rPr>
+          <w:highlight w:val="yellow"/>
+        </w:rPr>
+        <w:t>store.Add</w:t>
+      </w:r>
+      <w:proofErr w:type="spellEnd"/>
+      <w:proofErr w:type="gramEnd"/>
+      <w:r>
+        <w:rPr>
+          <w:highlight w:val="yellow"/>
+        </w:rPr>
+        <w:t>($</w:t>
+      </w:r>
+      <w:proofErr w:type="spellStart"/>
+      <w:r>
+        <w:rPr>
+          <w:highlight w:val="yellow"/>
+        </w:rPr>
+        <w:t>certToImport</w:t>
+      </w:r>
+      <w:proofErr w:type="spellEnd"/>
+      <w:r>
+        <w:rPr>
+          <w:highlight w:val="yellow"/>
+        </w:rPr>
+        <w:t>)</w:t>
+      </w:r>
+    </w:p>
+    <w:p>
+      <w:pPr>
+        <w:spacing w:after="0"/>
+      </w:pPr>
+      <w:r>
+        <w:rPr>
+          <w:highlight w:val="yellow"/>
+        </w:rPr>
+        <w:t>$</w:t>
+      </w:r>
+      <w:proofErr w:type="spellStart"/>
+      <w:proofErr w:type="gramStart"/>
+      <w:r>
+        <w:rPr>
+          <w:highlight w:val="yellow"/>
+        </w:rPr>
+        <w:t>store.Close</w:t>
+      </w:r>
+      <w:proofErr w:type="spellEnd"/>
+      <w:proofErr w:type="gramEnd"/>
+      <w:r>
+        <w:rPr>
+          <w:highlight w:val="yellow"/>
+        </w:rPr>
+        <w:t>()</w:t>
+      </w:r>
+    </w:p>
+    <w:p>
+      <w:pPr>
+        <w:spacing w:after="0"/>
+      </w:pPr>
+    </w:p>
+    <w:p>
+      <w:pPr>
+        <w:spacing w:after="0"/>
+        <w:rPr>
+          <w:b/>
+          <w:bCs/>
+        </w:rPr>
+      </w:pPr>
+      <w:r>
+        <w:rPr>
+          <w:b/>
+          <w:bCs/>
+        </w:rPr>
+        <w:t>Step 3: Update IIS Bindings</w:t>
+      </w:r>
+    </w:p>
+    <w:p>
+      <w:pPr>
+        <w:spacing w:after="0"/>
+      </w:pPr>
+      <w:r>
+        <w:t>Even though the name is the same, IIS might still be looking at the "old" version of that name.</w:t>
+      </w:r>
+    </w:p>
+    <w:p>
+      <w:pPr>
+        <w:numPr>
+          <w:ilvl w:val="0"/>
+          <w:numId w:val="5"/>
+        </w:numPr>
+        <w:spacing w:after="0"/>
+      </w:pPr>
+      <w:r>
+        <w:t xml:space="preserve">Open </w:t>
+      </w:r>
+      <w:r>
+        <w:rPr>
+          <w:b/>
+          <w:bCs/>
+        </w:rPr>
+        <w:t>IIS Manager</w:t>
+      </w:r>
+      <w:r>
+        <w:t xml:space="preserve"> -&gt; </w:t>
+      </w:r>
+      <w:proofErr w:type="spellStart"/>
+      <w:r>
+        <w:rPr>
+          <w:b/>
+          <w:bCs/>
+        </w:rPr>
+        <w:t>Ecommerce_Dashboard</w:t>
+      </w:r>
+      <w:proofErr w:type="spellEnd"/>
+      <w:r>
+        <w:t>.</w:t>
+      </w:r>
+    </w:p>
+    <w:p>
+      <w:pPr>
+        <w:numPr>
+          <w:ilvl w:val="0"/>
+          <w:numId w:val="5"/>
+        </w:numPr>
+        <w:spacing w:after="0"/>
+      </w:pPr>
+      <w:r>
+        <w:t xml:space="preserve">Click </w:t>
+      </w:r>
+      <w:r>
+        <w:rPr>
+          <w:b/>
+          <w:bCs/>
+        </w:rPr>
+        <w:t>Bindings...</w:t>
+      </w:r>
+      <w:r>
+        <w:t xml:space="preserve"> -&gt; Select </w:t>
+      </w:r>
+      <w:r>
+        <w:rPr>
+          <w:b/>
+          <w:bCs/>
+        </w:rPr>
+        <w:t>https</w:t>
+      </w:r>
+      <w:r>
+        <w:t xml:space="preserve"> -&gt; </w:t>
+      </w:r>
+      <w:r>
+        <w:rPr>
+          <w:b/>
+          <w:bCs/>
+        </w:rPr>
+        <w:t>Edit</w:t>
+      </w:r>
+      <w:r>
+        <w:t>.</w:t>
+      </w:r>
+    </w:p>
+    <w:p>
+      <w:pPr>
+        <w:numPr>
+          <w:ilvl w:val="0"/>
+          <w:numId w:val="5"/>
+        </w:numPr>
+        <w:spacing w:after="0"/>
+      </w:pPr>
+      <w:r>
+        <w:t xml:space="preserve">In the </w:t>
+      </w:r>
+      <w:r>
+        <w:rPr>
+          <w:b/>
+          <w:bCs/>
+        </w:rPr>
+        <w:t>SSL certificate</w:t>
+      </w:r>
+      <w:r>
+        <w:t xml:space="preserve"> dropdown, select the </w:t>
+      </w:r>
+      <w:r>
+        <w:rPr>
+          <w:b/>
+          <w:bCs/>
+        </w:rPr>
+        <w:t>new</w:t>
+      </w:r>
+      <w:r>
+        <w:t xml:space="preserve"> </w:t>
+      </w:r>
+      <w:proofErr w:type="spellStart"/>
+      <w:r>
+        <w:t>ecommerce.test</w:t>
+      </w:r>
+      <w:proofErr w:type="spellEnd"/>
+      <w:r>
+        <w:t xml:space="preserve"> (look at the expiration date in the dropdown to pick the one further in the future).</w:t>
+      </w:r>
+    </w:p>
+    <w:p>
+      <w:pPr>
+        <w:spacing w:after="0"/>
+        <w:ind w:left="720"/>
+      </w:pPr>
+    </w:p>
+    <w:p>
+      <w:pPr>
+        <w:numPr>
+          <w:ilvl w:val="0"/>
+          <w:numId w:val="5"/>
+        </w:numPr>
+        <w:spacing w:after="0"/>
+      </w:pPr>
+      <w:r>
+        <w:rPr>
+          <w:b/>
+          <w:bCs/>
+        </w:rPr>
+        <w:t>Restart</w:t>
+      </w:r>
+      <w:r>
+        <w:t xml:space="preserve"> the site.</w:t>
+      </w:r>
+    </w:p>
+    <w:p>
+      <w:pPr>
+        <w:spacing w:after="0"/>
+      </w:pPr>
+    </w:p>
+    <w:p>
+      <w:pPr>
+        <w:spacing w:after="0"/>
+        <w:rPr>
+          <w:b/>
+          <w:bCs/>
+        </w:rPr>
+      </w:pPr>
+      <w:r>
+        <w:rPr>
+          <w:b/>
+          <w:bCs/>
+        </w:rPr>
+        <w:t>How to check the expiry date</w:t>
+      </w:r>
+    </w:p>
+    <w:p>
+      <w:pPr>
+        <w:spacing w:after="0"/>
+      </w:pPr>
+      <w:r>
+        <w:t>You can check how much time you have left at any time without opening IIS:</w:t>
+      </w:r>
+    </w:p>
+    <w:p>
+      <w:pPr>
+        <w:numPr>
+          <w:ilvl w:val="0"/>
+          <w:numId w:val="6"/>
+        </w:numPr>
+        <w:spacing w:after="0"/>
+      </w:pPr>
+      <w:r>
+        <w:t xml:space="preserve">Click the </w:t>
+      </w:r>
+      <w:r>
+        <w:rPr>
+          <w:b/>
+          <w:bCs/>
+        </w:rPr>
+        <w:t>Lock Icon</w:t>
+      </w:r>
+      <w:r>
+        <w:t xml:space="preserve"> in Chrome.</w:t>
+      </w:r>
+    </w:p>
+    <w:p>
+      <w:pPr>
+        <w:numPr>
+          <w:ilvl w:val="0"/>
+          <w:numId w:val="6"/>
+        </w:numPr>
+        <w:spacing w:after="0"/>
+      </w:pPr>
+      <w:r>
+        <w:t xml:space="preserve">Click </w:t>
+      </w:r>
+      <w:r>
+        <w:rPr>
+          <w:b/>
+          <w:bCs/>
+        </w:rPr>
+        <w:t>Connection is secure</w:t>
+      </w:r>
+      <w:r>
+        <w:t xml:space="preserve"> -&gt; </w:t>
+      </w:r>
+      <w:r>
+        <w:rPr>
+          <w:b/>
+          <w:bCs/>
+        </w:rPr>
+        <w:t>Certificate is valid</w:t>
+      </w:r>
+      <w:r>
+        <w:t>.</w:t>
+      </w:r>
+    </w:p>
+    <w:p>
+      <w:pPr>
+        <w:numPr>
+          <w:ilvl w:val="0"/>
+          <w:numId w:val="6"/>
+        </w:numPr>
+        <w:spacing w:after="0"/>
+      </w:pPr>
+      <w:r>
+        <w:t xml:space="preserve">Check the </w:t>
+      </w:r>
+      <w:r>
+        <w:rPr>
+          <w:b/>
+          <w:bCs/>
+        </w:rPr>
+        <w:t>Validity Period</w:t>
+      </w:r>
+      <w:r>
+        <w:t>.</w:t>
       </w:r>
     </w:p>
     <w:p>
@@ -872,6 +1859,119 @@
     </w:lvl>
   </w:abstractNum>
   <w:abstractNum w:abstractNumId="2" w15:restartNumberingAfterBreak="0">
+    <w:nsid w:val="44C61CD8"/>
+    <w:multiLevelType w:val="multilevel"/>
+    <w:tmpl w:val="996AE306"/>
+    <w:lvl w:ilvl="0">
+      <w:start w:val="1"/>
+      <w:numFmt w:val="decimal"/>
+      <w:lvlText w:val="%1."/>
+      <w:lvlJc w:val="left"/>
+      <w:pPr>
+        <w:tabs>
+          <w:tab w:val="num" w:pos="720"/>
+        </w:tabs>
+        <w:ind w:left="720" w:hanging="360"/>
+      </w:pPr>
+    </w:lvl>
+    <w:lvl w:ilvl="1" w:tentative="1">
+      <w:start w:val="1"/>
+      <w:numFmt w:val="decimal"/>
+      <w:lvlText w:val="%2."/>
+      <w:lvlJc w:val="left"/>
+      <w:pPr>
+        <w:tabs>
+          <w:tab w:val="num" w:pos="1440"/>
+        </w:tabs>
+        <w:ind w:left="1440" w:hanging="360"/>
+      </w:pPr>
+    </w:lvl>
+    <w:lvl w:ilvl="2" w:tentative="1">
+      <w:start w:val="1"/>
+      <w:numFmt w:val="decimal"/>
+      <w:lvlText w:val="%3."/>
+      <w:lvlJc w:val="left"/>
+      <w:pPr>
+        <w:tabs>
+          <w:tab w:val="num" w:pos="2160"/>
+        </w:tabs>
+        <w:ind w:left="2160" w:hanging="360"/>
+      </w:pPr>
+    </w:lvl>
+    <w:lvl w:ilvl="3" w:tentative="1">
+      <w:start w:val="1"/>
+      <w:numFmt w:val="decimal"/>
+      <w:lvlText w:val="%4."/>
+      <w:lvlJc w:val="left"/>
+      <w:pPr>
+        <w:tabs>
+          <w:tab w:val="num" w:pos="2880"/>
+        </w:tabs>
+        <w:ind w:left="2880" w:hanging="360"/>
+      </w:pPr>
+    </w:lvl>
+    <w:lvl w:ilvl="4" w:tentative="1">
+      <w:start w:val="1"/>
+      <w:numFmt w:val="decimal"/>
+      <w:lvlText w:val="%5."/>
+      <w:lvlJc w:val="left"/>
+      <w:pPr>
+        <w:tabs>
+          <w:tab w:val="num" w:pos="3600"/>
+        </w:tabs>
+        <w:ind w:left="3600" w:hanging="360"/>
+      </w:pPr>
+    </w:lvl>
+    <w:lvl w:ilvl="5" w:tentative="1">
+      <w:start w:val="1"/>
+      <w:numFmt w:val="decimal"/>
+      <w:lvlText w:val="%6."/>
+      <w:lvlJc w:val="left"/>
+      <w:pPr>
+        <w:tabs>
+          <w:tab w:val="num" w:pos="4320"/>
+        </w:tabs>
+        <w:ind w:left="4320" w:hanging="360"/>
+      </w:pPr>
+    </w:lvl>
+    <w:lvl w:ilvl="6" w:tentative="1">
+      <w:start w:val="1"/>
+      <w:numFmt w:val="decimal"/>
+      <w:lvlText w:val="%7."/>
+      <w:lvlJc w:val="left"/>
+      <w:pPr>
+        <w:tabs>
+          <w:tab w:val="num" w:pos="5040"/>
+        </w:tabs>
+        <w:ind w:left="5040" w:hanging="360"/>
+      </w:pPr>
+    </w:lvl>
+    <w:lvl w:ilvl="7" w:tentative="1">
+      <w:start w:val="1"/>
+      <w:numFmt w:val="decimal"/>
+      <w:lvlText w:val="%8."/>
+      <w:lvlJc w:val="left"/>
+      <w:pPr>
+        <w:tabs>
+          <w:tab w:val="num" w:pos="5760"/>
+        </w:tabs>
+        <w:ind w:left="5760" w:hanging="360"/>
+      </w:pPr>
+    </w:lvl>
+    <w:lvl w:ilvl="8" w:tentative="1">
+      <w:start w:val="1"/>
+      <w:numFmt w:val="decimal"/>
+      <w:lvlText w:val="%9."/>
+      <w:lvlJc w:val="left"/>
+      <w:pPr>
+        <w:tabs>
+          <w:tab w:val="num" w:pos="6480"/>
+        </w:tabs>
+        <w:ind w:left="6480" w:hanging="360"/>
+      </w:pPr>
+    </w:lvl>
+  </w:abstractNum>
+  <w:abstractNum w:abstractNumId="3" w15:restartNumberingAfterBreak="0">
     <w:nsid w:val="659727FA"/>
     <w:multiLevelType w:val="multilevel"/>
     <w:tmpl w:val="BC7A45F6"/>
@@ -984,7 +2084,120 @@
       </w:pPr>
     </w:lvl>
   </w:abstractNum>
-  <w:abstractNum w:abstractNumId="3" w15:restartNumberingAfterBreak="0">
+  <w:abstractNum w:abstractNumId="4" w15:restartNumberingAfterBreak="0">
+    <w:nsid w:val="76AE3CF8"/>
+    <w:multiLevelType w:val="multilevel"/>
+    <w:tmpl w:val="4C6ACFDA"/>
+    <w:lvl w:ilvl="0">
+      <w:start w:val="1"/>
+      <w:numFmt w:val="decimal"/>
+      <w:lvlText w:val="%1."/>
+      <w:lvlJc w:val="left"/>
+      <w:pPr>
+        <w:tabs>
+          <w:tab w:val="num" w:pos="720"/>
+        </w:tabs>
+        <w:ind w:left="720" w:hanging="360"/>
+      </w:pPr>
+    </w:lvl>
+    <w:lvl w:ilvl="1" w:tentative="1">
+      <w:start w:val="1"/>
+      <w:numFmt w:val="decimal"/>
+      <w:lvlText w:val="%2."/>
+      <w:lvlJc w:val="left"/>
+      <w:pPr>
+        <w:tabs>
+          <w:tab w:val="num" w:pos="1440"/>
+        </w:tabs>
+        <w:ind w:left="1440" w:hanging="360"/>
+      </w:pPr>
+    </w:lvl>
+    <w:lvl w:ilvl="2" w:tentative="1">
+      <w:start w:val="1"/>
+      <w:numFmt w:val="decimal"/>
+      <w:lvlText w:val="%3."/>
+      <w:lvlJc w:val="left"/>
+      <w:pPr>
+        <w:tabs>
+          <w:tab w:val="num" w:pos="2160"/>
+        </w:tabs>
+        <w:ind w:left="2160" w:hanging="360"/>
+      </w:pPr>
+    </w:lvl>
+    <w:lvl w:ilvl="3" w:tentative="1">
+      <w:start w:val="1"/>
+      <w:numFmt w:val="decimal"/>
+      <w:lvlText w:val="%4."/>
+      <w:lvlJc w:val="left"/>
+      <w:pPr>
+        <w:tabs>
+          <w:tab w:val="num" w:pos="2880"/>
+        </w:tabs>
+        <w:ind w:left="2880" w:hanging="360"/>
+      </w:pPr>
+    </w:lvl>
+    <w:lvl w:ilvl="4" w:tentative="1">
+      <w:start w:val="1"/>
+      <w:numFmt w:val="decimal"/>
+      <w:lvlText w:val="%5."/>
+      <w:lvlJc w:val="left"/>
+      <w:pPr>
+        <w:tabs>
+          <w:tab w:val="num" w:pos="3600"/>
+        </w:tabs>
+        <w:ind w:left="3600" w:hanging="360"/>
+      </w:pPr>
+    </w:lvl>
+    <w:lvl w:ilvl="5" w:tentative="1">
+      <w:start w:val="1"/>
+      <w:numFmt w:val="decimal"/>
+      <w:lvlText w:val="%6."/>
+      <w:lvlJc w:val="left"/>
+      <w:pPr>
+        <w:tabs>
+          <w:tab w:val="num" w:pos="4320"/>
+        </w:tabs>
+        <w:ind w:left="4320" w:hanging="360"/>
+      </w:pPr>
+    </w:lvl>
+    <w:lvl w:ilvl="6" w:tentative="1">
+      <w:start w:val="1"/>
+      <w:numFmt w:val="decimal"/>
+      <w:lvlText w:val="%7."/>
+      <w:lvlJc w:val="left"/>
+      <w:pPr>
+        <w:tabs>
+          <w:tab w:val="num" w:pos="5040"/>
+        </w:tabs>
+        <w:ind w:left="5040" w:hanging="360"/>
+      </w:pPr>
+    </w:lvl>
+    <w:lvl w:ilvl="7" w:tentative="1">
+      <w:start w:val="1"/>
+      <w:numFmt w:val="decimal"/>
+      <w:lvlText w:val="%8."/>
+      <w:lvlJc w:val="left"/>
+      <w:pPr>
+        <w:tabs>
+          <w:tab w:val="num" w:pos="5760"/>
+        </w:tabs>
+        <w:ind w:left="5760" w:hanging="360"/>
+      </w:pPr>
+    </w:lvl>
+    <w:lvl w:ilvl="8" w:tentative="1">
+      <w:start w:val="1"/>
+      <w:numFmt w:val="decimal"/>
+      <w:lvlText w:val="%9."/>
+      <w:lvlJc w:val="left"/>
+      <w:pPr>
+        <w:tabs>
+          <w:tab w:val="num" w:pos="6480"/>
+        </w:tabs>
+        <w:ind w:left="6480" w:hanging="360"/>
+      </w:pPr>
+    </w:lvl>
+  </w:abstractNum>
+  <w:abstractNum w:abstractNumId="5" w15:restartNumberingAfterBreak="0">
     <w:nsid w:val="7C080F24"/>
     <w:multiLevelType w:val="multilevel"/>
     <w:tmpl w:val="F026883E"/>
@@ -1137,13 +2350,19 @@
     <w:abstractNumId w:val="1"/>
   </w:num>
   <w:num w:numId="2" w16cid:durableId="953823218">
-    <w:abstractNumId w:val="2"/>
+    <w:abstractNumId w:val="3"/>
   </w:num>
   <w:num w:numId="3" w16cid:durableId="630749528">
     <w:abstractNumId w:val="0"/>
   </w:num>
   <w:num w:numId="4" w16cid:durableId="431821993">
-    <w:abstractNumId w:val="3"/>
+    <w:abstractNumId w:val="5"/>
+  </w:num>
+  <w:num w:numId="5" w16cid:durableId="2104959541">
+    <w:abstractNumId w:val="2"/>
+  </w:num>
+  <w:num w:numId="6" w16cid:durableId="1092553745">
+    <w:abstractNumId w:val="4"/>
   </w:num>
 </w:numbering>
 </file>

</xml_diff>